<commit_message>
Update tracked docs and sensor configuration
Modified tracked files: architecture README, ADC124 ghosting test document, sensor configurations.

Co-Authored-By: Claude Sonnet 5.5 <noreply@anthropic.com>
</commit_message>
<xml_diff>
--- a/docs/testing/benchmarks/testboard-adc124/Ghosting Tests TestBoard_ADC124.docx
+++ b/docs/testing/benchmarks/testboard-adc124/Ghosting Tests TestBoard_ADC124.docx
@@ -2813,10 +2813,10 @@
       </w:r>
       <w:proofErr w:type="spellEnd"/>
       <w:r>
-        <w:t xml:space="preserve"> switching).</w:t>
-      </w:r>
-      <w:r>
-        <w:t>).</w:t>
+        <w:t xml:space="preserve"> switching)</w:t>
+      </w:r>
+      <w:r>
+        <w:t>.</w:t>
       </w:r>
     </w:p>
     <w:p>
@@ -6552,6 +6552,1376 @@
               <w:t>200mv</w:t>
             </w:r>
           </w:p>
+        </w:tc>
+      </w:tr>
+    </w:tbl>
+    <w:p/>
+    <w:p>
+      <w:r>
+        <w:br w:type="page"/>
+      </w:r>
+    </w:p>
+    <w:p>
+      <w:r>
+        <w:lastRenderedPageBreak/>
+        <w:t xml:space="preserve">Tests above were for blocking SPI engine. </w:t>
+      </w:r>
+    </w:p>
+    <w:p>
+      <w:r>
+        <w:t>For LPSPI engine these are the sampling rates:</w:t>
+      </w:r>
+    </w:p>
+    <w:p/>
+    <w:tbl>
+      <w:tblPr>
+        <w:tblStyle w:val="TableGrid"/>
+        <w:tblW w:w="0" w:type="auto"/>
+        <w:tblLook w:val="04A0" w:firstRow="1" w:lastRow="0" w:firstColumn="1" w:lastColumn="0" w:noHBand="0" w:noVBand="1"/>
+      </w:tblPr>
+      <w:tblGrid>
+        <w:gridCol w:w="896"/>
+        <w:gridCol w:w="1241"/>
+        <w:gridCol w:w="1134"/>
+        <w:gridCol w:w="1094"/>
+        <w:gridCol w:w="1271"/>
+        <w:gridCol w:w="1271"/>
+        <w:gridCol w:w="1241"/>
+        <w:gridCol w:w="1202"/>
+      </w:tblGrid>
+      <w:tr>
+        <w:tc>
+          <w:tcPr>
+            <w:tcW w:w="896" w:type="dxa"/>
+          </w:tcPr>
+          <w:p>
+            <w:r>
+              <w:t>Scan Mode</w:t>
+            </w:r>
+          </w:p>
+        </w:tc>
+        <w:tc>
+          <w:tcPr>
+            <w:tcW w:w="1241" w:type="dxa"/>
+          </w:tcPr>
+          <w:p>
+            <w:r>
+              <w:t>Channel Settle [us]</w:t>
+            </w:r>
+          </w:p>
+        </w:tc>
+        <w:tc>
+          <w:tcPr>
+            <w:tcW w:w="1134" w:type="dxa"/>
+          </w:tcPr>
+          <w:p>
+            <w:proofErr w:type="spellStart"/>
+            <w:r>
+              <w:t>Vmid</w:t>
+            </w:r>
+            <w:proofErr w:type="spellEnd"/>
+            <w:r>
+              <w:t xml:space="preserve"> Settle [us]</w:t>
+            </w:r>
+          </w:p>
+        </w:tc>
+        <w:tc>
+          <w:tcPr>
+            <w:tcW w:w="1094" w:type="dxa"/>
+          </w:tcPr>
+          <w:p>
+            <w:r>
+              <w:t xml:space="preserve">ADC scan after </w:t>
+            </w:r>
+            <w:proofErr w:type="spellStart"/>
+            <w:r>
+              <w:t>vmid</w:t>
+            </w:r>
+            <w:proofErr w:type="spellEnd"/>
+          </w:p>
+        </w:tc>
+        <w:tc>
+          <w:tcPr>
+            <w:tcW w:w="1271" w:type="dxa"/>
+          </w:tcPr>
+          <w:p>
+            <w:r>
+              <w:t>Blocking:</w:t>
+            </w:r>
+          </w:p>
+          <w:p>
+            <w:r>
+              <w:t>Channel SPS [Hz]</w:t>
+            </w:r>
+          </w:p>
+        </w:tc>
+        <w:tc>
+          <w:tcPr>
+            <w:tcW w:w="1271" w:type="dxa"/>
+          </w:tcPr>
+          <w:p>
+            <w:r>
+              <w:t>Blocking:</w:t>
+            </w:r>
+          </w:p>
+          <w:p>
+            <w:r>
+              <w:t>Interval [us]</w:t>
+            </w:r>
+          </w:p>
+        </w:tc>
+        <w:tc>
+          <w:tcPr>
+            <w:tcW w:w="1241" w:type="dxa"/>
+          </w:tcPr>
+          <w:p>
+            <w:r>
+              <w:t>LPSPI:</w:t>
+            </w:r>
+          </w:p>
+          <w:p>
+            <w:r>
+              <w:t>Channel SPS [Hz]</w:t>
+            </w:r>
+          </w:p>
+        </w:tc>
+        <w:tc>
+          <w:tcPr>
+            <w:tcW w:w="1202" w:type="dxa"/>
+          </w:tcPr>
+          <w:p>
+            <w:r>
+              <w:t>LPSPI:</w:t>
+            </w:r>
+          </w:p>
+          <w:p>
+            <w:r>
+              <w:t>Interval [us]</w:t>
+            </w:r>
+          </w:p>
+        </w:tc>
+      </w:tr>
+      <w:tr>
+        <w:tc>
+          <w:tcPr>
+            <w:tcW w:w="896" w:type="dxa"/>
+          </w:tcPr>
+          <w:p>
+            <w:r>
+              <w:t>ADC</w:t>
+            </w:r>
+          </w:p>
+        </w:tc>
+        <w:tc>
+          <w:tcPr>
+            <w:tcW w:w="1241" w:type="dxa"/>
+          </w:tcPr>
+          <w:p>
+            <w:r>
+              <w:t>5</w:t>
+            </w:r>
+          </w:p>
+        </w:tc>
+        <w:tc>
+          <w:tcPr>
+            <w:tcW w:w="1134" w:type="dxa"/>
+          </w:tcPr>
+          <w:p>
+            <w:r>
+              <w:t xml:space="preserve">(no </w:t>
+            </w:r>
+            <w:proofErr w:type="spellStart"/>
+            <w:r>
+              <w:t>vmid</w:t>
+            </w:r>
+            <w:proofErr w:type="spellEnd"/>
+            <w:r>
+              <w:t>)</w:t>
+            </w:r>
+          </w:p>
+        </w:tc>
+        <w:tc>
+          <w:tcPr>
+            <w:tcW w:w="1094" w:type="dxa"/>
+          </w:tcPr>
+          <w:p>
+            <w:r>
+              <w:t xml:space="preserve">(no </w:t>
+            </w:r>
+            <w:proofErr w:type="spellStart"/>
+            <w:r>
+              <w:t>vmid</w:t>
+            </w:r>
+            <w:proofErr w:type="spellEnd"/>
+            <w:r>
+              <w:t>)</w:t>
+            </w:r>
+          </w:p>
+        </w:tc>
+        <w:tc>
+          <w:tcPr>
+            <w:tcW w:w="1271" w:type="dxa"/>
+          </w:tcPr>
+          <w:p/>
+        </w:tc>
+        <w:tc>
+          <w:tcPr>
+            <w:tcW w:w="1271" w:type="dxa"/>
+          </w:tcPr>
+          <w:p/>
+        </w:tc>
+        <w:tc>
+          <w:tcPr>
+            <w:tcW w:w="1241" w:type="dxa"/>
+          </w:tcPr>
+          <w:p>
+            <w:r>
+              <w:t>6736</w:t>
+            </w:r>
+          </w:p>
+        </w:tc>
+        <w:tc>
+          <w:tcPr>
+            <w:tcW w:w="1202" w:type="dxa"/>
+          </w:tcPr>
+          <w:p>
+            <w:r>
+              <w:t>3</w:t>
+            </w:r>
+          </w:p>
+        </w:tc>
+      </w:tr>
+      <w:tr>
+        <w:tc>
+          <w:tcPr>
+            <w:tcW w:w="896" w:type="dxa"/>
+          </w:tcPr>
+          <w:p>
+            <w:r>
+              <w:t>ADC</w:t>
+            </w:r>
+          </w:p>
+        </w:tc>
+        <w:tc>
+          <w:tcPr>
+            <w:tcW w:w="1241" w:type="dxa"/>
+          </w:tcPr>
+          <w:p>
+            <w:r>
+              <w:t>5</w:t>
+            </w:r>
+          </w:p>
+        </w:tc>
+        <w:tc>
+          <w:tcPr>
+            <w:tcW w:w="1134" w:type="dxa"/>
+          </w:tcPr>
+          <w:p>
+            <w:r>
+              <w:t>0</w:t>
+            </w:r>
+          </w:p>
+        </w:tc>
+        <w:tc>
+          <w:tcPr>
+            <w:tcW w:w="1094" w:type="dxa"/>
+          </w:tcPr>
+          <w:p>
+            <w:r>
+              <w:t>yes</w:t>
+            </w:r>
+          </w:p>
+        </w:tc>
+        <w:tc>
+          <w:tcPr>
+            <w:tcW w:w="1271" w:type="dxa"/>
+          </w:tcPr>
+          <w:p>
+            <w:r>
+              <w:t>4140</w:t>
+            </w:r>
+          </w:p>
+        </w:tc>
+        <w:tc>
+          <w:tcPr>
+            <w:tcW w:w="1271" w:type="dxa"/>
+          </w:tcPr>
+          <w:p>
+            <w:r>
+              <w:t>5</w:t>
+            </w:r>
+          </w:p>
+        </w:tc>
+        <w:tc>
+          <w:tcPr>
+            <w:tcW w:w="1241" w:type="dxa"/>
+          </w:tcPr>
+          <w:p/>
+        </w:tc>
+        <w:tc>
+          <w:tcPr>
+            <w:tcW w:w="1202" w:type="dxa"/>
+          </w:tcPr>
+          <w:p/>
+        </w:tc>
+      </w:tr>
+      <w:tr>
+        <w:tc>
+          <w:tcPr>
+            <w:tcW w:w="896" w:type="dxa"/>
+          </w:tcPr>
+          <w:p>
+            <w:r>
+              <w:t>MUX</w:t>
+            </w:r>
+          </w:p>
+        </w:tc>
+        <w:tc>
+          <w:tcPr>
+            <w:tcW w:w="1241" w:type="dxa"/>
+          </w:tcPr>
+          <w:p>
+            <w:r>
+              <w:t>5</w:t>
+            </w:r>
+          </w:p>
+        </w:tc>
+        <w:tc>
+          <w:tcPr>
+            <w:tcW w:w="1134" w:type="dxa"/>
+          </w:tcPr>
+          <w:p>
+            <w:r>
+              <w:t>0</w:t>
+            </w:r>
+          </w:p>
+        </w:tc>
+        <w:tc>
+          <w:tcPr>
+            <w:tcW w:w="1094" w:type="dxa"/>
+          </w:tcPr>
+          <w:p>
+            <w:r>
+              <w:t>yes</w:t>
+            </w:r>
+          </w:p>
+        </w:tc>
+        <w:tc>
+          <w:tcPr>
+            <w:tcW w:w="1271" w:type="dxa"/>
+          </w:tcPr>
+          <w:p>
+            <w:r>
+              <w:t>5000</w:t>
+            </w:r>
+          </w:p>
+        </w:tc>
+        <w:tc>
+          <w:tcPr>
+            <w:tcW w:w="1271" w:type="dxa"/>
+          </w:tcPr>
+          <w:p>
+            <w:r>
+              <w:t>4</w:t>
+            </w:r>
+          </w:p>
+        </w:tc>
+        <w:tc>
+          <w:tcPr>
+            <w:tcW w:w="1241" w:type="dxa"/>
+          </w:tcPr>
+          <w:p/>
+        </w:tc>
+        <w:tc>
+          <w:tcPr>
+            <w:tcW w:w="1202" w:type="dxa"/>
+          </w:tcPr>
+          <w:p/>
+        </w:tc>
+      </w:tr>
+      <w:tr>
+        <w:tc>
+          <w:tcPr>
+            <w:tcW w:w="896" w:type="dxa"/>
+          </w:tcPr>
+          <w:p>
+            <w:r>
+              <w:t>ADC</w:t>
+            </w:r>
+          </w:p>
+        </w:tc>
+        <w:tc>
+          <w:tcPr>
+            <w:tcW w:w="1241" w:type="dxa"/>
+          </w:tcPr>
+          <w:p>
+            <w:r>
+              <w:t>1</w:t>
+            </w:r>
+          </w:p>
+        </w:tc>
+        <w:tc>
+          <w:tcPr>
+            <w:tcW w:w="1134" w:type="dxa"/>
+          </w:tcPr>
+          <w:p>
+            <w:r>
+              <w:t>0</w:t>
+            </w:r>
+          </w:p>
+        </w:tc>
+        <w:tc>
+          <w:tcPr>
+            <w:tcW w:w="1094" w:type="dxa"/>
+          </w:tcPr>
+          <w:p>
+            <w:r>
+              <w:t>yes</w:t>
+            </w:r>
+          </w:p>
+        </w:tc>
+        <w:tc>
+          <w:tcPr>
+            <w:tcW w:w="1271" w:type="dxa"/>
+          </w:tcPr>
+          <w:p>
+            <w:r>
+              <w:t>5375</w:t>
+            </w:r>
+          </w:p>
+        </w:tc>
+        <w:tc>
+          <w:tcPr>
+            <w:tcW w:w="1271" w:type="dxa"/>
+          </w:tcPr>
+          <w:p>
+            <w:r>
+              <w:t>4</w:t>
+            </w:r>
+          </w:p>
+        </w:tc>
+        <w:tc>
+          <w:tcPr>
+            <w:tcW w:w="1241" w:type="dxa"/>
+          </w:tcPr>
+          <w:p/>
+        </w:tc>
+        <w:tc>
+          <w:tcPr>
+            <w:tcW w:w="1202" w:type="dxa"/>
+          </w:tcPr>
+          <w:p/>
+        </w:tc>
+      </w:tr>
+      <w:tr>
+        <w:tc>
+          <w:tcPr>
+            <w:tcW w:w="896" w:type="dxa"/>
+          </w:tcPr>
+          <w:p>
+            <w:r>
+              <w:t>ADC</w:t>
+            </w:r>
+          </w:p>
+        </w:tc>
+        <w:tc>
+          <w:tcPr>
+            <w:tcW w:w="1241" w:type="dxa"/>
+          </w:tcPr>
+          <w:p>
+            <w:r>
+              <w:t>1</w:t>
+            </w:r>
+          </w:p>
+        </w:tc>
+        <w:tc>
+          <w:tcPr>
+            <w:tcW w:w="1134" w:type="dxa"/>
+          </w:tcPr>
+          <w:p>
+            <w:r>
+              <w:t>0</w:t>
+            </w:r>
+          </w:p>
+        </w:tc>
+        <w:tc>
+          <w:tcPr>
+            <w:tcW w:w="1094" w:type="dxa"/>
+          </w:tcPr>
+          <w:p>
+            <w:r>
+              <w:t>no</w:t>
+            </w:r>
+          </w:p>
+        </w:tc>
+        <w:tc>
+          <w:tcPr>
+            <w:tcW w:w="1271" w:type="dxa"/>
+          </w:tcPr>
+          <w:p>
+            <w:r>
+              <w:t>9320</w:t>
+            </w:r>
+          </w:p>
+        </w:tc>
+        <w:tc>
+          <w:tcPr>
+            <w:tcW w:w="1271" w:type="dxa"/>
+          </w:tcPr>
+          <w:p>
+            <w:r>
+              <w:t>2</w:t>
+            </w:r>
+          </w:p>
+        </w:tc>
+        <w:tc>
+          <w:tcPr>
+            <w:tcW w:w="1241" w:type="dxa"/>
+          </w:tcPr>
+          <w:p>
+            <w:r>
+              <w:t>10000</w:t>
+            </w:r>
+          </w:p>
+        </w:tc>
+        <w:tc>
+          <w:tcPr>
+            <w:tcW w:w="1202" w:type="dxa"/>
+          </w:tcPr>
+          <w:p>
+            <w:r>
+              <w:t>2</w:t>
+            </w:r>
+          </w:p>
+        </w:tc>
+      </w:tr>
+      <w:tr>
+        <w:tc>
+          <w:tcPr>
+            <w:tcW w:w="896" w:type="dxa"/>
+          </w:tcPr>
+          <w:p>
+            <w:r>
+              <w:t>ADC</w:t>
+            </w:r>
+          </w:p>
+        </w:tc>
+        <w:tc>
+          <w:tcPr>
+            <w:tcW w:w="1241" w:type="dxa"/>
+          </w:tcPr>
+          <w:p>
+            <w:r>
+              <w:t>1</w:t>
+            </w:r>
+          </w:p>
+        </w:tc>
+        <w:tc>
+          <w:tcPr>
+            <w:tcW w:w="1134" w:type="dxa"/>
+          </w:tcPr>
+          <w:p>
+            <w:r>
+              <w:t>5</w:t>
+            </w:r>
+          </w:p>
+        </w:tc>
+        <w:tc>
+          <w:tcPr>
+            <w:tcW w:w="1094" w:type="dxa"/>
+          </w:tcPr>
+          <w:p>
+            <w:r>
+              <w:t>no</w:t>
+            </w:r>
+          </w:p>
+        </w:tc>
+        <w:tc>
+          <w:tcPr>
+            <w:tcW w:w="1271" w:type="dxa"/>
+          </w:tcPr>
+          <w:p>
+            <w:r>
+              <w:t>5620</w:t>
+            </w:r>
+          </w:p>
+        </w:tc>
+        <w:tc>
+          <w:tcPr>
+            <w:tcW w:w="1271" w:type="dxa"/>
+          </w:tcPr>
+          <w:p>
+            <w:r>
+              <w:t>4</w:t>
+            </w:r>
+          </w:p>
+        </w:tc>
+        <w:tc>
+          <w:tcPr>
+            <w:tcW w:w="1241" w:type="dxa"/>
+          </w:tcPr>
+          <w:p>
+            <w:r>
+              <w:t>5880</w:t>
+            </w:r>
+          </w:p>
+        </w:tc>
+        <w:tc>
+          <w:tcPr>
+            <w:tcW w:w="1202" w:type="dxa"/>
+          </w:tcPr>
+          <w:p>
+            <w:r>
+              <w:t>3</w:t>
+            </w:r>
+          </w:p>
+        </w:tc>
+      </w:tr>
+    </w:tbl>
+    <w:p/>
+    <w:p/>
+    <w:p>
+      <w:r>
+        <w:br w:type="page"/>
+      </w:r>
+    </w:p>
+    <w:p>
+      <w:pPr>
+        <w:rPr>
+          <w:b/>
+          <w:bCs/>
+          <w:u w:val="single"/>
+        </w:rPr>
+      </w:pPr>
+      <w:r>
+        <w:rPr>
+          <w:b/>
+          <w:bCs/>
+          <w:u w:val="single"/>
+        </w:rPr>
+        <w:lastRenderedPageBreak/>
+        <w:t>Comparing TestBoard_7953 and TestBoard_ADC124 Signals:</w:t>
+      </w:r>
+    </w:p>
+    <w:p>
+      <w:r>
+        <w:t>Using sensor strip: v12b 8/5/26</w:t>
+      </w:r>
+    </w:p>
+    <w:p/>
+    <w:p>
+      <w:r>
+        <w:t>TestBoard_7953:</w:t>
+      </w:r>
+    </w:p>
+    <w:p>
+      <w:proofErr w:type="spellStart"/>
+      <w:r>
+        <w:t>Vmid</w:t>
+      </w:r>
+      <w:proofErr w:type="spellEnd"/>
+      <w:r>
+        <w:t xml:space="preserve"> on, 20Mhz SPI, </w:t>
+      </w:r>
+      <w:r>
+        <w:t xml:space="preserve">Ref:2.5V, </w:t>
+      </w:r>
+      <w:r>
+        <w:t>Sampling rate (GUI): 6750 Hz</w:t>
+      </w:r>
+    </w:p>
+    <w:p/>
+    <w:p>
+      <w:r>
+        <w:t>TestBoard_ADC124:</w:t>
+      </w:r>
+    </w:p>
+    <w:p>
+      <w:proofErr w:type="spellStart"/>
+      <w:r>
+        <w:t>Vmid</w:t>
+      </w:r>
+      <w:proofErr w:type="spellEnd"/>
+      <w:r>
+        <w:t xml:space="preserve"> on, Settle: 1us on channel, 5us on </w:t>
+      </w:r>
+      <w:proofErr w:type="spellStart"/>
+      <w:r>
+        <w:t>vmid</w:t>
+      </w:r>
+      <w:proofErr w:type="spellEnd"/>
+      <w:r>
+        <w:t>, ADC mode, Sampling rate (GUI): 5880 Hz</w:t>
+      </w:r>
+    </w:p>
+    <w:p>
+      <w:r>
+        <w:t>Testing only array2</w:t>
+      </w:r>
+    </w:p>
+    <w:p/>
+    <w:p>
+      <w:proofErr w:type="spellStart"/>
+      <w:r>
+        <w:t>TestBoard</w:t>
+      </w:r>
+      <w:proofErr w:type="spellEnd"/>
+      <w:r>
+        <w:t xml:space="preserve"> PCB1.7:</w:t>
+      </w:r>
+    </w:p>
+    <w:p>
+      <w:proofErr w:type="spellStart"/>
+      <w:r>
+        <w:t>Vmid</w:t>
+      </w:r>
+      <w:proofErr w:type="spellEnd"/>
+      <w:r>
+        <w:t xml:space="preserve"> on, Sampling rate (GUI): 680Hz</w:t>
+      </w:r>
+    </w:p>
+    <w:p/>
+    <w:tbl>
+      <w:tblPr>
+        <w:tblStyle w:val="TableGrid"/>
+        <w:tblW w:w="0" w:type="auto"/>
+        <w:tblLook w:val="04A0" w:firstRow="1" w:lastRow="0" w:firstColumn="1" w:lastColumn="0" w:noHBand="0" w:noVBand="1"/>
+      </w:tblPr>
+      <w:tblGrid>
+        <w:gridCol w:w="1327"/>
+        <w:gridCol w:w="1959"/>
+        <w:gridCol w:w="2104"/>
+        <w:gridCol w:w="2365"/>
+        <w:gridCol w:w="1595"/>
+      </w:tblGrid>
+      <w:tr>
+        <w:tc>
+          <w:tcPr>
+            <w:tcW w:w="1327" w:type="dxa"/>
+          </w:tcPr>
+          <w:p>
+            <w:pPr>
+              <w:rPr>
+                <w:b/>
+                <w:bCs/>
+              </w:rPr>
+            </w:pPr>
+            <w:r>
+              <w:rPr>
+                <w:b/>
+                <w:bCs/>
+              </w:rPr>
+              <w:t>Sensor</w:t>
+            </w:r>
+          </w:p>
+        </w:tc>
+        <w:tc>
+          <w:tcPr>
+            <w:tcW w:w="1959" w:type="dxa"/>
+          </w:tcPr>
+          <w:p>
+            <w:pPr>
+              <w:rPr>
+                <w:b/>
+                <w:bCs/>
+              </w:rPr>
+            </w:pPr>
+            <w:r>
+              <w:rPr>
+                <w:b/>
+                <w:bCs/>
+              </w:rPr>
+              <w:t>7953_array1 [mv]</w:t>
+            </w:r>
+          </w:p>
+        </w:tc>
+        <w:tc>
+          <w:tcPr>
+            <w:tcW w:w="2104" w:type="dxa"/>
+          </w:tcPr>
+          <w:p>
+            <w:pPr>
+              <w:rPr>
+                <w:b/>
+                <w:bCs/>
+              </w:rPr>
+            </w:pPr>
+            <w:r>
+              <w:rPr>
+                <w:b/>
+                <w:bCs/>
+              </w:rPr>
+              <w:t>7953_array2 [mv]</w:t>
+            </w:r>
+          </w:p>
+        </w:tc>
+        <w:tc>
+          <w:tcPr>
+            <w:tcW w:w="2365" w:type="dxa"/>
+          </w:tcPr>
+          <w:p>
+            <w:pPr>
+              <w:rPr>
+                <w:b/>
+                <w:bCs/>
+              </w:rPr>
+            </w:pPr>
+            <w:r>
+              <w:rPr>
+                <w:b/>
+                <w:bCs/>
+              </w:rPr>
+              <w:t>ADC124_array2 [mv]</w:t>
+            </w:r>
+          </w:p>
+        </w:tc>
+        <w:tc>
+          <w:tcPr>
+            <w:tcW w:w="1595" w:type="dxa"/>
+          </w:tcPr>
+          <w:p>
+            <w:pPr>
+              <w:rPr>
+                <w:b/>
+                <w:bCs/>
+              </w:rPr>
+            </w:pPr>
+            <w:r>
+              <w:rPr>
+                <w:b/>
+                <w:bCs/>
+              </w:rPr>
+              <w:t>PCB1.7 [mv]</w:t>
+            </w:r>
+          </w:p>
+        </w:tc>
+      </w:tr>
+      <w:tr>
+        <w:tc>
+          <w:tcPr>
+            <w:tcW w:w="1327" w:type="dxa"/>
+          </w:tcPr>
+          <w:p>
+            <w:r>
+              <w:t>PZT1_T</w:t>
+            </w:r>
+          </w:p>
+        </w:tc>
+        <w:tc>
+          <w:tcPr>
+            <w:tcW w:w="1959" w:type="dxa"/>
+          </w:tcPr>
+          <w:p>
+            <w:r>
+              <w:t>200</w:t>
+            </w:r>
+          </w:p>
+        </w:tc>
+        <w:tc>
+          <w:tcPr>
+            <w:tcW w:w="2104" w:type="dxa"/>
+          </w:tcPr>
+          <w:p>
+            <w:r>
+              <w:t>200</w:t>
+            </w:r>
+          </w:p>
+        </w:tc>
+        <w:tc>
+          <w:tcPr>
+            <w:tcW w:w="2365" w:type="dxa"/>
+          </w:tcPr>
+          <w:p>
+            <w:r>
+              <w:t>200</w:t>
+            </w:r>
+          </w:p>
+        </w:tc>
+        <w:tc>
+          <w:tcPr>
+            <w:tcW w:w="1595" w:type="dxa"/>
+          </w:tcPr>
+          <w:p>
+            <w:r>
+              <w:t>650</w:t>
+            </w:r>
+          </w:p>
+        </w:tc>
+      </w:tr>
+      <w:tr>
+        <w:tc>
+          <w:tcPr>
+            <w:tcW w:w="1327" w:type="dxa"/>
+          </w:tcPr>
+          <w:p>
+            <w:r>
+              <w:t>PZT1_C</w:t>
+            </w:r>
+          </w:p>
+        </w:tc>
+        <w:tc>
+          <w:tcPr>
+            <w:tcW w:w="1959" w:type="dxa"/>
+          </w:tcPr>
+          <w:p>
+            <w:r>
+              <w:t>150</w:t>
+            </w:r>
+          </w:p>
+        </w:tc>
+        <w:tc>
+          <w:tcPr>
+            <w:tcW w:w="2104" w:type="dxa"/>
+          </w:tcPr>
+          <w:p>
+            <w:r>
+              <w:t>150</w:t>
+            </w:r>
+          </w:p>
+        </w:tc>
+        <w:tc>
+          <w:tcPr>
+            <w:tcW w:w="2365" w:type="dxa"/>
+          </w:tcPr>
+          <w:p>
+            <w:r>
+              <w:t>200</w:t>
+            </w:r>
+          </w:p>
+        </w:tc>
+        <w:tc>
+          <w:tcPr>
+            <w:tcW w:w="1595" w:type="dxa"/>
+          </w:tcPr>
+          <w:p>
+            <w:r>
+              <w:t>600</w:t>
+            </w:r>
+          </w:p>
+        </w:tc>
+      </w:tr>
+      <w:tr>
+        <w:tc>
+          <w:tcPr>
+            <w:tcW w:w="1327" w:type="dxa"/>
+          </w:tcPr>
+          <w:p>
+            <w:r>
+              <w:t>PZT3_T</w:t>
+            </w:r>
+          </w:p>
+        </w:tc>
+        <w:tc>
+          <w:tcPr>
+            <w:tcW w:w="1959" w:type="dxa"/>
+          </w:tcPr>
+          <w:p>
+            <w:r>
+              <w:t>250</w:t>
+            </w:r>
+          </w:p>
+        </w:tc>
+        <w:tc>
+          <w:tcPr>
+            <w:tcW w:w="2104" w:type="dxa"/>
+          </w:tcPr>
+          <w:p>
+            <w:r>
+              <w:t>150</w:t>
+            </w:r>
+          </w:p>
+        </w:tc>
+        <w:tc>
+          <w:tcPr>
+            <w:tcW w:w="2365" w:type="dxa"/>
+          </w:tcPr>
+          <w:p>
+            <w:r>
+              <w:t>150</w:t>
+            </w:r>
+          </w:p>
+        </w:tc>
+        <w:tc>
+          <w:tcPr>
+            <w:tcW w:w="1595" w:type="dxa"/>
+          </w:tcPr>
+          <w:p>
+            <w:r>
+              <w:t>500</w:t>
+            </w:r>
+          </w:p>
+        </w:tc>
+      </w:tr>
+      <w:tr>
+        <w:tc>
+          <w:tcPr>
+            <w:tcW w:w="1327" w:type="dxa"/>
+          </w:tcPr>
+          <w:p>
+            <w:r>
+              <w:t>PZT3_C</w:t>
+            </w:r>
+          </w:p>
+        </w:tc>
+        <w:tc>
+          <w:tcPr>
+            <w:tcW w:w="1959" w:type="dxa"/>
+          </w:tcPr>
+          <w:p>
+            <w:r>
+              <w:t>300</w:t>
+            </w:r>
+          </w:p>
+        </w:tc>
+        <w:tc>
+          <w:tcPr>
+            <w:tcW w:w="2104" w:type="dxa"/>
+          </w:tcPr>
+          <w:p>
+            <w:r>
+              <w:t>250</w:t>
+            </w:r>
+          </w:p>
+        </w:tc>
+        <w:tc>
+          <w:tcPr>
+            <w:tcW w:w="2365" w:type="dxa"/>
+          </w:tcPr>
+          <w:p>
+            <w:r>
+              <w:t>250</w:t>
+            </w:r>
+          </w:p>
+        </w:tc>
+        <w:tc>
+          <w:tcPr>
+            <w:tcW w:w="1595" w:type="dxa"/>
+          </w:tcPr>
+          <w:p>
+            <w:r>
+              <w:t>400</w:t>
+            </w:r>
+          </w:p>
+        </w:tc>
+      </w:tr>
+      <w:tr>
+        <w:tc>
+          <w:tcPr>
+            <w:tcW w:w="1327" w:type="dxa"/>
+          </w:tcPr>
+          <w:p>
+            <w:r>
+              <w:t>PZT</w:t>
+            </w:r>
+            <w:r>
+              <w:t>5</w:t>
+            </w:r>
+            <w:r>
+              <w:t>_T</w:t>
+            </w:r>
+          </w:p>
+        </w:tc>
+        <w:tc>
+          <w:tcPr>
+            <w:tcW w:w="1959" w:type="dxa"/>
+          </w:tcPr>
+          <w:p>
+            <w:r>
+              <w:t>250</w:t>
+            </w:r>
+          </w:p>
+        </w:tc>
+        <w:tc>
+          <w:tcPr>
+            <w:tcW w:w="2104" w:type="dxa"/>
+          </w:tcPr>
+          <w:p>
+            <w:r>
+              <w:t>250</w:t>
+            </w:r>
+          </w:p>
+        </w:tc>
+        <w:tc>
+          <w:tcPr>
+            <w:tcW w:w="2365" w:type="dxa"/>
+          </w:tcPr>
+          <w:p>
+            <w:r>
+              <w:t>250</w:t>
+            </w:r>
+          </w:p>
+        </w:tc>
+        <w:tc>
+          <w:tcPr>
+            <w:tcW w:w="1595" w:type="dxa"/>
+          </w:tcPr>
+          <w:p>
+            <w:r>
+              <w:t>1000</w:t>
+            </w:r>
+          </w:p>
+        </w:tc>
+      </w:tr>
+      <w:tr>
+        <w:tc>
+          <w:tcPr>
+            <w:tcW w:w="1327" w:type="dxa"/>
+          </w:tcPr>
+          <w:p>
+            <w:r>
+              <w:t>PZT</w:t>
+            </w:r>
+            <w:r>
+              <w:t>5</w:t>
+            </w:r>
+            <w:r>
+              <w:t>_C</w:t>
+            </w:r>
+          </w:p>
+        </w:tc>
+        <w:tc>
+          <w:tcPr>
+            <w:tcW w:w="1959" w:type="dxa"/>
+          </w:tcPr>
+          <w:p>
+            <w:r>
+              <w:t>250</w:t>
+            </w:r>
+          </w:p>
+        </w:tc>
+        <w:tc>
+          <w:tcPr>
+            <w:tcW w:w="2104" w:type="dxa"/>
+          </w:tcPr>
+          <w:p>
+            <w:r>
+              <w:t>200</w:t>
+            </w:r>
+          </w:p>
+        </w:tc>
+        <w:tc>
+          <w:tcPr>
+            <w:tcW w:w="2365" w:type="dxa"/>
+          </w:tcPr>
+          <w:p>
+            <w:r>
+              <w:t>300</w:t>
+            </w:r>
+          </w:p>
+        </w:tc>
+        <w:tc>
+          <w:tcPr>
+            <w:tcW w:w="1595" w:type="dxa"/>
+          </w:tcPr>
+          <w:p>
+            <w:r>
+              <w:t>1000</w:t>
+            </w:r>
+          </w:p>
+        </w:tc>
+      </w:tr>
+      <w:tr>
+        <w:tc>
+          <w:tcPr>
+            <w:tcW w:w="1327" w:type="dxa"/>
+          </w:tcPr>
+          <w:p>
+            <w:r>
+              <w:t>PZT</w:t>
+            </w:r>
+            <w:r>
+              <w:t>6</w:t>
+            </w:r>
+            <w:r>
+              <w:t>_T</w:t>
+            </w:r>
+          </w:p>
+        </w:tc>
+        <w:tc>
+          <w:tcPr>
+            <w:tcW w:w="1959" w:type="dxa"/>
+          </w:tcPr>
+          <w:p>
+            <w:r>
+              <w:t>200</w:t>
+            </w:r>
+          </w:p>
+        </w:tc>
+        <w:tc>
+          <w:tcPr>
+            <w:tcW w:w="2104" w:type="dxa"/>
+          </w:tcPr>
+          <w:p>
+            <w:r>
+              <w:t>150</w:t>
+            </w:r>
+          </w:p>
+        </w:tc>
+        <w:tc>
+          <w:tcPr>
+            <w:tcW w:w="2365" w:type="dxa"/>
+          </w:tcPr>
+          <w:p>
+            <w:r>
+              <w:t>150</w:t>
+            </w:r>
+          </w:p>
+        </w:tc>
+        <w:tc>
+          <w:tcPr>
+            <w:tcW w:w="1595" w:type="dxa"/>
+          </w:tcPr>
+          <w:p/>
+        </w:tc>
+      </w:tr>
+      <w:tr>
+        <w:tc>
+          <w:tcPr>
+            <w:tcW w:w="1327" w:type="dxa"/>
+          </w:tcPr>
+          <w:p>
+            <w:r>
+              <w:t>PZT</w:t>
+            </w:r>
+            <w:r>
+              <w:t>6</w:t>
+            </w:r>
+            <w:r>
+              <w:t>_C</w:t>
+            </w:r>
+          </w:p>
+        </w:tc>
+        <w:tc>
+          <w:tcPr>
+            <w:tcW w:w="1959" w:type="dxa"/>
+          </w:tcPr>
+          <w:p>
+            <w:r>
+              <w:t>200</w:t>
+            </w:r>
+          </w:p>
+        </w:tc>
+        <w:tc>
+          <w:tcPr>
+            <w:tcW w:w="2104" w:type="dxa"/>
+          </w:tcPr>
+          <w:p>
+            <w:r>
+              <w:t>200</w:t>
+            </w:r>
+          </w:p>
+        </w:tc>
+        <w:tc>
+          <w:tcPr>
+            <w:tcW w:w="2365" w:type="dxa"/>
+          </w:tcPr>
+          <w:p>
+            <w:r>
+              <w:t>200</w:t>
+            </w:r>
+          </w:p>
+        </w:tc>
+        <w:tc>
+          <w:tcPr>
+            <w:tcW w:w="1595" w:type="dxa"/>
+          </w:tcPr>
+          <w:p/>
+        </w:tc>
+      </w:tr>
+      <w:tr>
+        <w:tc>
+          <w:tcPr>
+            <w:tcW w:w="1327" w:type="dxa"/>
+          </w:tcPr>
+          <w:p>
+            <w:r>
+              <w:t>PZT7_T</w:t>
+            </w:r>
+          </w:p>
+        </w:tc>
+        <w:tc>
+          <w:tcPr>
+            <w:tcW w:w="1959" w:type="dxa"/>
+          </w:tcPr>
+          <w:p>
+            <w:r>
+              <w:t>250</w:t>
+            </w:r>
+          </w:p>
+        </w:tc>
+        <w:tc>
+          <w:tcPr>
+            <w:tcW w:w="2104" w:type="dxa"/>
+          </w:tcPr>
+          <w:p>
+            <w:r>
+              <w:t>250</w:t>
+            </w:r>
+          </w:p>
+        </w:tc>
+        <w:tc>
+          <w:tcPr>
+            <w:tcW w:w="2365" w:type="dxa"/>
+          </w:tcPr>
+          <w:p>
+            <w:r>
+              <w:t>200</w:t>
+            </w:r>
+          </w:p>
+        </w:tc>
+        <w:tc>
+          <w:tcPr>
+            <w:tcW w:w="1595" w:type="dxa"/>
+          </w:tcPr>
+          <w:p/>
+        </w:tc>
+      </w:tr>
+      <w:tr>
+        <w:tc>
+          <w:tcPr>
+            <w:tcW w:w="1327" w:type="dxa"/>
+          </w:tcPr>
+          <w:p>
+            <w:r>
+              <w:t>PZT7_C</w:t>
+            </w:r>
+          </w:p>
+        </w:tc>
+        <w:tc>
+          <w:tcPr>
+            <w:tcW w:w="1959" w:type="dxa"/>
+          </w:tcPr>
+          <w:p>
+            <w:r>
+              <w:t>150</w:t>
+            </w:r>
+          </w:p>
+        </w:tc>
+        <w:tc>
+          <w:tcPr>
+            <w:tcW w:w="2104" w:type="dxa"/>
+          </w:tcPr>
+          <w:p>
+            <w:r>
+              <w:t>250</w:t>
+            </w:r>
+          </w:p>
+        </w:tc>
+        <w:tc>
+          <w:tcPr>
+            <w:tcW w:w="2365" w:type="dxa"/>
+          </w:tcPr>
+          <w:p>
+            <w:r>
+              <w:t>250</w:t>
+            </w:r>
+          </w:p>
+        </w:tc>
+        <w:tc>
+          <w:tcPr>
+            <w:tcW w:w="1595" w:type="dxa"/>
+          </w:tcPr>
+          <w:p/>
         </w:tc>
       </w:tr>
     </w:tbl>

</xml_diff>